<commit_message>
Brand M5-002 Pi lesson resources
</commit_message>
<xml_diff>
--- a/resources/mathematics/M5-002/methodology/open-lesson-plan.docx
+++ b/resources/mathematics/M5-002/methodology/open-lesson-plan.docx
@@ -1248,6 +1248,7 @@
         </w:rPr>
         <w:sectPr>
           <w:headerReference w:type="default" r:id="rId7"/>
+          <w:footerReference w:type="default" r:id="rId19"/>
           <w:pgSz w:w="11906" w:h="16838"/>
           <w:pgMar w:top="709" w:right="566" w:bottom="851" w:left="851" w:header="708" w:footer="708" w:gutter="0"/>
           <w:cols w:space="708"/>
@@ -5172,6 +5173,323 @@
     </w:p>
   </w:endnote>
 </w:endnotes>
+</file>
+
+<file path=word/footer1.xml><?xml version="1.0" encoding="utf-8"?>
+<w:ftr xmlns:m="http://schemas.openxmlformats.org/officeDocument/2006/math" xmlns:mc="http://schemas.openxmlformats.org/markup-compatibility/2006" xmlns:mo="http://schemas.microsoft.com/office/mac/office/2008/main" xmlns:mv="urn:schemas-microsoft-com:mac:vml" xmlns:o="urn:schemas-microsoft-com:office:office" xmlns:r="http://schemas.openxmlformats.org/officeDocument/2006/relationships" xmlns:v="urn:schemas-microsoft-com:vml" xmlns:w10="urn:schemas-microsoft-com:office:word" xmlns:w14="http://schemas.microsoft.com/office/word/2010/wordml" xmlns:w="http://schemas.openxmlformats.org/wordprocessingml/2006/main" xmlns:wne="http://schemas.microsoft.com/office/word/2006/wordml" xmlns:wp14="http://schemas.microsoft.com/office/word/2010/wordprocessingDrawing" xmlns:wp="http://schemas.openxmlformats.org/drawingml/2006/wordprocessingDrawing" xmlns:wpc="http://schemas.microsoft.com/office/word/2010/wordprocessingCanvas" xmlns:wpg="http://schemas.microsoft.com/office/word/2010/wordprocessingGroup" xmlns:wpi="http://schemas.microsoft.com/office/word/2010/wordprocessingInk" xmlns:wps="http://schemas.microsoft.com/office/word/2010/wordprocessingShape" mc:Ignorable="w14 wp14">
+  <w:p>
+    <w:pPr>
+      <w:pStyle w:val="Footer"/>
+      <w:jc w:val="right"/>
+    </w:pPr>
+    <w:r>
+      <w:drawing>
+        <wp:inline xmlns:a="http://schemas.openxmlformats.org/drawingml/2006/main" xmlns:pic="http://schemas.openxmlformats.org/drawingml/2006/picture">
+          <wp:extent cx="1005840" cy="1048232"/>
+          <wp:docPr id="1" name="Picture 1"/>
+          <wp:cNvGraphicFramePr>
+            <a:graphicFrameLocks noChangeAspect="1"/>
+          </wp:cNvGraphicFramePr>
+          <a:graphic>
+            <a:graphicData uri="http://schemas.openxmlformats.org/drawingml/2006/picture">
+              <pic:pic>
+                <pic:nvPicPr>
+                  <pic:cNvPr id="0" name="em-logo.png"/>
+                  <pic:cNvPicPr/>
+                </pic:nvPicPr>
+                <pic:blipFill>
+                  <a:blip r:embed="rId1"/>
+                  <a:stretch>
+                    <a:fillRect/>
+                  </a:stretch>
+                </pic:blipFill>
+                <pic:spPr>
+                  <a:xfrm>
+                    <a:off x="0" y="0"/>
+                    <a:ext cx="1005840" cy="1048232"/>
+                  </a:xfrm>
+                  <a:prstGeom prst="rect"/>
+                </pic:spPr>
+              </pic:pic>
+            </a:graphicData>
+          </a:graphic>
+        </wp:inline>
+      </w:drawing>
+    </w:r>
+    <w:r>
+      <w:drawing>
+        <wp:inline xmlns:a="http://schemas.openxmlformats.org/drawingml/2006/main" xmlns:pic="http://schemas.openxmlformats.org/drawingml/2006/picture">
+          <wp:extent cx="1005840" cy="1048232"/>
+          <wp:docPr id="2" name="Picture 2"/>
+          <wp:cNvGraphicFramePr>
+            <a:graphicFrameLocks noChangeAspect="1"/>
+          </wp:cNvGraphicFramePr>
+          <a:graphic>
+            <a:graphicData uri="http://schemas.openxmlformats.org/drawingml/2006/picture">
+              <pic:pic>
+                <pic:nvPicPr>
+                  <pic:cNvPr id="0" name="em-logo.png"/>
+                  <pic:cNvPicPr/>
+                </pic:nvPicPr>
+                <pic:blipFill>
+                  <a:blip r:embed="rId1"/>
+                  <a:stretch>
+                    <a:fillRect/>
+                  </a:stretch>
+                </pic:blipFill>
+                <pic:spPr>
+                  <a:xfrm>
+                    <a:off x="0" y="0"/>
+                    <a:ext cx="1005840" cy="1048232"/>
+                  </a:xfrm>
+                  <a:prstGeom prst="rect"/>
+                </pic:spPr>
+              </pic:pic>
+            </a:graphicData>
+          </a:graphic>
+        </wp:inline>
+      </w:drawing>
+    </w:r>
+    <w:r>
+      <w:drawing>
+        <wp:inline xmlns:a="http://schemas.openxmlformats.org/drawingml/2006/main" xmlns:pic="http://schemas.openxmlformats.org/drawingml/2006/picture">
+          <wp:extent cx="1005840" cy="1048232"/>
+          <wp:docPr id="3" name="Picture 3"/>
+          <wp:cNvGraphicFramePr>
+            <a:graphicFrameLocks noChangeAspect="1"/>
+          </wp:cNvGraphicFramePr>
+          <a:graphic>
+            <a:graphicData uri="http://schemas.openxmlformats.org/drawingml/2006/picture">
+              <pic:pic>
+                <pic:nvPicPr>
+                  <pic:cNvPr id="0" name="em-logo.png"/>
+                  <pic:cNvPicPr/>
+                </pic:nvPicPr>
+                <pic:blipFill>
+                  <a:blip r:embed="rId1"/>
+                  <a:stretch>
+                    <a:fillRect/>
+                  </a:stretch>
+                </pic:blipFill>
+                <pic:spPr>
+                  <a:xfrm>
+                    <a:off x="0" y="0"/>
+                    <a:ext cx="1005840" cy="1048232"/>
+                  </a:xfrm>
+                  <a:prstGeom prst="rect"/>
+                </pic:spPr>
+              </pic:pic>
+            </a:graphicData>
+          </a:graphic>
+        </wp:inline>
+      </w:drawing>
+    </w:r>
+    <w:r>
+      <w:drawing>
+        <wp:inline xmlns:a="http://schemas.openxmlformats.org/drawingml/2006/main" xmlns:pic="http://schemas.openxmlformats.org/drawingml/2006/picture">
+          <wp:extent cx="1005840" cy="1048232"/>
+          <wp:docPr id="4" name="Picture 4"/>
+          <wp:cNvGraphicFramePr>
+            <a:graphicFrameLocks noChangeAspect="1"/>
+          </wp:cNvGraphicFramePr>
+          <a:graphic>
+            <a:graphicData uri="http://schemas.openxmlformats.org/drawingml/2006/picture">
+              <pic:pic>
+                <pic:nvPicPr>
+                  <pic:cNvPr id="0" name="em-logo.png"/>
+                  <pic:cNvPicPr/>
+                </pic:nvPicPr>
+                <pic:blipFill>
+                  <a:blip r:embed="rId1"/>
+                  <a:stretch>
+                    <a:fillRect/>
+                  </a:stretch>
+                </pic:blipFill>
+                <pic:spPr>
+                  <a:xfrm>
+                    <a:off x="0" y="0"/>
+                    <a:ext cx="1005840" cy="1048232"/>
+                  </a:xfrm>
+                  <a:prstGeom prst="rect"/>
+                </pic:spPr>
+              </pic:pic>
+            </a:graphicData>
+          </a:graphic>
+        </wp:inline>
+      </w:drawing>
+    </w:r>
+    <w:r>
+      <w:drawing>
+        <wp:inline xmlns:a="http://schemas.openxmlformats.org/drawingml/2006/main" xmlns:pic="http://schemas.openxmlformats.org/drawingml/2006/picture">
+          <wp:extent cx="1005840" cy="1048232"/>
+          <wp:docPr id="5" name="Picture 5"/>
+          <wp:cNvGraphicFramePr>
+            <a:graphicFrameLocks noChangeAspect="1"/>
+          </wp:cNvGraphicFramePr>
+          <a:graphic>
+            <a:graphicData uri="http://schemas.openxmlformats.org/drawingml/2006/picture">
+              <pic:pic>
+                <pic:nvPicPr>
+                  <pic:cNvPr id="0" name="em-logo.png"/>
+                  <pic:cNvPicPr/>
+                </pic:nvPicPr>
+                <pic:blipFill>
+                  <a:blip r:embed="rId1"/>
+                  <a:stretch>
+                    <a:fillRect/>
+                  </a:stretch>
+                </pic:blipFill>
+                <pic:spPr>
+                  <a:xfrm>
+                    <a:off x="0" y="0"/>
+                    <a:ext cx="1005840" cy="1048232"/>
+                  </a:xfrm>
+                  <a:prstGeom prst="rect"/>
+                </pic:spPr>
+              </pic:pic>
+            </a:graphicData>
+          </a:graphic>
+        </wp:inline>
+      </w:drawing>
+    </w:r>
+    <w:r>
+      <w:drawing>
+        <wp:inline xmlns:a="http://schemas.openxmlformats.org/drawingml/2006/main" xmlns:pic="http://schemas.openxmlformats.org/drawingml/2006/picture">
+          <wp:extent cx="1005840" cy="1048232"/>
+          <wp:docPr id="6" name="Picture 6"/>
+          <wp:cNvGraphicFramePr>
+            <a:graphicFrameLocks noChangeAspect="1"/>
+          </wp:cNvGraphicFramePr>
+          <a:graphic>
+            <a:graphicData uri="http://schemas.openxmlformats.org/drawingml/2006/picture">
+              <pic:pic>
+                <pic:nvPicPr>
+                  <pic:cNvPr id="0" name="em-logo.png"/>
+                  <pic:cNvPicPr/>
+                </pic:nvPicPr>
+                <pic:blipFill>
+                  <a:blip r:embed="rId1"/>
+                  <a:stretch>
+                    <a:fillRect/>
+                  </a:stretch>
+                </pic:blipFill>
+                <pic:spPr>
+                  <a:xfrm>
+                    <a:off x="0" y="0"/>
+                    <a:ext cx="1005840" cy="1048232"/>
+                  </a:xfrm>
+                  <a:prstGeom prst="rect"/>
+                </pic:spPr>
+              </pic:pic>
+            </a:graphicData>
+          </a:graphic>
+        </wp:inline>
+      </w:drawing>
+    </w:r>
+    <w:r>
+      <w:drawing>
+        <wp:inline xmlns:a="http://schemas.openxmlformats.org/drawingml/2006/main" xmlns:pic="http://schemas.openxmlformats.org/drawingml/2006/picture">
+          <wp:extent cx="1005840" cy="1048232"/>
+          <wp:docPr id="7" name="Picture 7"/>
+          <wp:cNvGraphicFramePr>
+            <a:graphicFrameLocks noChangeAspect="1"/>
+          </wp:cNvGraphicFramePr>
+          <a:graphic>
+            <a:graphicData uri="http://schemas.openxmlformats.org/drawingml/2006/picture">
+              <pic:pic>
+                <pic:nvPicPr>
+                  <pic:cNvPr id="0" name="em-logo.png"/>
+                  <pic:cNvPicPr/>
+                </pic:nvPicPr>
+                <pic:blipFill>
+                  <a:blip r:embed="rId1"/>
+                  <a:stretch>
+                    <a:fillRect/>
+                  </a:stretch>
+                </pic:blipFill>
+                <pic:spPr>
+                  <a:xfrm>
+                    <a:off x="0" y="0"/>
+                    <a:ext cx="1005840" cy="1048232"/>
+                  </a:xfrm>
+                  <a:prstGeom prst="rect"/>
+                </pic:spPr>
+              </pic:pic>
+            </a:graphicData>
+          </a:graphic>
+        </wp:inline>
+      </w:drawing>
+    </w:r>
+    <w:r>
+      <w:drawing>
+        <wp:inline xmlns:a="http://schemas.openxmlformats.org/drawingml/2006/main" xmlns:pic="http://schemas.openxmlformats.org/drawingml/2006/picture">
+          <wp:extent cx="1005840" cy="1048232"/>
+          <wp:docPr id="8" name="Picture 8"/>
+          <wp:cNvGraphicFramePr>
+            <a:graphicFrameLocks noChangeAspect="1"/>
+          </wp:cNvGraphicFramePr>
+          <a:graphic>
+            <a:graphicData uri="http://schemas.openxmlformats.org/drawingml/2006/picture">
+              <pic:pic>
+                <pic:nvPicPr>
+                  <pic:cNvPr id="0" name="em-logo.png"/>
+                  <pic:cNvPicPr/>
+                </pic:nvPicPr>
+                <pic:blipFill>
+                  <a:blip r:embed="rId1"/>
+                  <a:stretch>
+                    <a:fillRect/>
+                  </a:stretch>
+                </pic:blipFill>
+                <pic:spPr>
+                  <a:xfrm>
+                    <a:off x="0" y="0"/>
+                    <a:ext cx="1005840" cy="1048232"/>
+                  </a:xfrm>
+                  <a:prstGeom prst="rect"/>
+                </pic:spPr>
+              </pic:pic>
+            </a:graphicData>
+          </a:graphic>
+        </wp:inline>
+      </w:drawing>
+    </w:r>
+    <w:r>
+      <w:drawing>
+        <wp:inline xmlns:a="http://schemas.openxmlformats.org/drawingml/2006/main" xmlns:pic="http://schemas.openxmlformats.org/drawingml/2006/picture">
+          <wp:extent cx="1005840" cy="1048232"/>
+          <wp:docPr id="9" name="Picture 9"/>
+          <wp:cNvGraphicFramePr>
+            <a:graphicFrameLocks noChangeAspect="1"/>
+          </wp:cNvGraphicFramePr>
+          <a:graphic>
+            <a:graphicData uri="http://schemas.openxmlformats.org/drawingml/2006/picture">
+              <pic:pic>
+                <pic:nvPicPr>
+                  <pic:cNvPr id="0" name="em-logo.png"/>
+                  <pic:cNvPicPr/>
+                </pic:nvPicPr>
+                <pic:blipFill>
+                  <a:blip r:embed="rId1"/>
+                  <a:stretch>
+                    <a:fillRect/>
+                  </a:stretch>
+                </pic:blipFill>
+                <pic:spPr>
+                  <a:xfrm>
+                    <a:off x="0" y="0"/>
+                    <a:ext cx="1005840" cy="1048232"/>
+                  </a:xfrm>
+                  <a:prstGeom prst="rect"/>
+                </pic:spPr>
+              </pic:pic>
+            </a:graphicData>
+          </a:graphic>
+        </wp:inline>
+      </w:drawing>
+    </w:r>
+  </w:p>
+</w:ftr>
 </file>
 
 <file path=word/footnotes.xml><?xml version="1.0" encoding="utf-8"?>

</xml_diff>